<commit_message>
Revise Speaker 2 speech: smoother transitions, simpler wording
Co-Authored-By: Claude Sonnet 5.5 <noreply@anthropic.com>
Claude-Session: https://claude.ai/code/session_01Lx1Twscw41wCKBVfzYKUb6
</commit_message>
<xml_diff>
--- a/Speaker2_speech.docx
+++ b/Speaker2_speech.docx
@@ -7,7 +7,7 @@
         <w:spacing w:after="160"/>
       </w:pPr>
       <w:r>
-        <w:t>Thank you. My teammate has set the scene: a cosmopolitan Tang court, the Court of Diplomatic Reception, and a legal duty to report to the Bureau of Historiography. I'd like to open the black box. What actually happened between an envoy's arrival and a line in a history book? Then I'll test it against three cases.</w:t>
+        <w:t>Thank you. My teammate has shown us the setting: a busy Tang capital, a Court with twenty interpreters, and a rule to report to the Bureau of Historiography. But how did this work in real life? First I will explain the system. Then I will test it with three cases.</w:t>
       </w:r>
     </w:p>
     <w:p>
@@ -15,7 +15,7 @@
         <w:spacing w:after="160"/>
       </w:pPr>
       <w:r>
-        <w:t>First, the mechanism, in four steps.</w:t>
+        <w:t>Step one is the interview. The Tang Huiyao says that when a mission arrived, the Court had to ask about the country's land and customs, its dress, the tribute it brought, the distance and route, and the names of its leaders.</w:t>
       </w:r>
     </w:p>
     <w:p>
@@ -23,7 +23,7 @@
         <w:spacing w:after="160"/>
       </w:pPr>
       <w:r>
-        <w:t>Step one: the interview. According to the Tang Huiyao, the Court examined each mission on a standard list: the country's natural conditions and customs, its dress, its tribute goods, the distance and route, and the names of its leaders.</w:t>
+        <w:t>Now, who asked these questions, and in what language? That is step two. Sometimes officials from other offices joined too. But the envoy and the officials did not speak the same language. So everyone in the room heard the envoy through the interpreter.</w:t>
       </w:r>
     </w:p>
     <w:p>
@@ -31,7 +31,7 @@
         <w:spacing w:after="160"/>
       </w:pPr>
       <w:r>
-        <w:t>Step two: who is in the room. A special agent from the Department of Arms could also attend, to gather geography. But whoever asked, the envoy and the officials did not share a language. So the interpreter's rendering is what everyone heard, and most likely what got written down.</w:t>
+        <w:t>After the interview comes step three: the record. The Tang Liudian says that maps of the foreign places and pictures of the envoys were drawn. Copies went to the Secretariat, and the originals stayed in the Court. A written report also went to the Bureau.</w:t>
       </w:r>
     </w:p>
     <w:p>
@@ -39,7 +39,7 @@
         <w:spacing w:after="160"/>
       </w:pPr>
       <w:r>
-        <w:t>Step three: the record. The Tang Liudian says maps and portraits of the envoys were drawn, with copies sent to the Secretariat and originals kept at the Court. A written report went to the Bureau.</w:t>
+        <w:t>And what did historians do with it? That is step four. We do not know if they copied the reports or changed them. But for a faraway country, the interview could be the only direct source.</w:t>
       </w:r>
     </w:p>
     <w:p>
@@ -47,7 +47,7 @@
         <w:spacing w:after="160"/>
       </w:pPr>
       <w:r>
-        <w:t>Step four: compilation. We don't know whether historians copied these reports or edited them. But for a distant country, the interview may have been their only direct source.</w:t>
+        <w:t>So the system shows that interpreters' notes could be used. Now let us see whether they really were.</w:t>
       </w:r>
     </w:p>
     <w:p>
@@ -55,7 +55,7 @@
         <w:spacing w:after="160"/>
       </w:pPr>
       <w:r>
-        <w:t>So the mechanism shows that interpreters' notes could become history. The cases suggest that they did.</w:t>
+        <w:t>Case one comes from the Tang itself: the Kirghiz envoys in AD 843. The Xin Tangshu says the emperor told an interpreter to ask about the Kirghiz land and customs. Then the chief minister, Li Deyu, sent in a report with a painting of the envoys. Here we see the whole system at work: interview, pictures, report. And notice this: the interpreter asks the questions himself. He does more than pass on words.</w:t>
       </w:r>
     </w:p>
     <w:p>
@@ -63,7 +63,7 @@
         <w:spacing w:after="160"/>
       </w:pPr>
       <w:r>
-        <w:t>Case one: the Kirghiz envoys in AD 843. The Xin Tangshu says Emperor Wuzong told an interpreter to ask about the Kirghiz landscape and customs. The chief minister Li Deyu then submitted a memorial with a portrait and a written account, and a ten-chapter illustrated memoir followed. This is the mechanism in action: interview, pictures, report. And the interpreter is asking questions himself, not just relaying them.</w:t>
+        <w:t>Was this only a Tang habit? Case two says no. The Suishu mostly describes events, not conversations. Yet it keeps the answer of a Yamato envoy in AD 600. Asked about Japanese customs, he said his ruler saw Heaven as her elder brother and the sun as her younger brother. Lung thinks this answer came through an interpreter and went almost straight into the history. So the practice is older than the Tang.</w:t>
       </w:r>
     </w:p>
     <w:p>
@@ -71,7 +71,7 @@
         <w:spacing w:after="160"/>
       </w:pPr>
       <w:r>
-        <w:t>Case two: the Sui dynasty. The Suishu is mostly descriptive and rarely records dialogue. Yet it preserves a Yamato envoy's answer in AD 600 about Japanese customs. He said his ruler treated Heaven as her elder brother and the sun as her younger brother. Lung infers that this was an interpreter-mediated account, written almost directly into history. So the practice was older than the Tang.</w:t>
+        <w:t>Case three is the strongest, and older still: the Liang dynasty. The Zhigong Tu, a painting from the sixth century, has short texts about thirteen countries. They follow the same list of questions as the Tang interviews. Lung compared them with the Liangshu, the history of Liang, finished in AD 636. Many texts are almost the same, word for word. About 95 percent of the Hephthalite text matches, and about 90 percent of the Dengzhi text. Lung admits the numbers are rough, but such close wording is no accident.</w:t>
       </w:r>
     </w:p>
     <w:p>
@@ -79,15 +79,7 @@
         <w:spacing w:after="160"/>
       </w:pPr>
       <w:r>
-        <w:t>Case three, the strongest: the Zhigong Tu from the Liang dynasty. Its texts on thirteen countries follow the same checklist as the Tang interviews. Lung compared them with the Liangshu, completed in AD 636. The account of Langya Xiu is almost word for word the same. Her rough figures are about 95 percent resemblance for the Hephthalites and 90 percent for Dengzhi. She calls them impressionistic, but identical wording is unlikely to be an accident.</w:t>
-      </w:r>
-    </w:p>
-    <w:p>
-      <w:pPr>
-        <w:spacing w:after="160"/>
-      </w:pPr>
-      <w:r>
-        <w:t>So we can trace a chain: interview, interpreter's report, Bureau, standard history. Yet no interpreter's notes survive, so the link is inferred. How far can we trust it, and what does it mean for us? My teammate will take that up next. Thank you.</w:t>
+        <w:t>Now put the cases together. We see a chain: interview, interpreter's report, the Bureau, and then the official history. But there is a weak spot. No interpreter's notes have survived, so the link is a good guess, not proof. How strong is that guess, and what does it mean for us as interpreters? My teammate will take that up next. Thank you.</w:t>
       </w:r>
     </w:p>
     <w:sectPr>

</xml_diff>

<commit_message>
Speaker 2 speech: name the institutional mechanism and its four steps
Co-Authored-By: Claude Sonnet 5.5 <noreply@anthropic.com>
Claude-Session: https://claude.ai/code/session_01Lx1Twscw41wCKBVfzYKUb6
</commit_message>
<xml_diff>
--- a/Speaker2_speech.docx
+++ b/Speaker2_speech.docx
@@ -7,7 +7,7 @@
         <w:spacing w:after="160"/>
       </w:pPr>
       <w:r>
-        <w:t>Thank you. My teammate has shown us the setting: a busy Tang capital, a Court with twenty interpreters, and a rule to report to the Bureau of Historiography. But how did this work in real life? First I will explain the system. Then I will test it with three cases.</w:t>
+        <w:t>Thank you. My teammate has shown us the setting: a busy Tang capital, a Court with twenty interpreters, and a rule to report to the Bureau of Historiography. But how did this work in real life? First, I will explain the institutional mechanism. It has four steps. Then I will test it with three cases.</w:t>
       </w:r>
     </w:p>
     <w:p>
@@ -47,7 +47,7 @@
         <w:spacing w:after="160"/>
       </w:pPr>
       <w:r>
-        <w:t>So the system shows that interpreters' notes could be used. Now let us see whether they really were.</w:t>
+        <w:t>So the mechanism shows that interpreters' notes could be used. Now let us see whether they really were.</w:t>
       </w:r>
     </w:p>
     <w:p>
@@ -55,7 +55,7 @@
         <w:spacing w:after="160"/>
       </w:pPr>
       <w:r>
-        <w:t>Case one comes from the Tang itself: the Kirghiz envoys in AD 843. The Xin Tangshu says the emperor told an interpreter to ask about the Kirghiz land and customs. Then the chief minister, Li Deyu, sent in a report with a painting of the envoys. Here we see the whole system at work: interview, pictures, report. And notice this: the interpreter asks the questions himself. He does more than pass on words.</w:t>
+        <w:t>Case one comes from the Tang itself: the Kirghiz envoys in AD 843. The Xin Tangshu says the emperor told an interpreter to ask about the Kirghiz land and customs. Then the chief minister, Li Deyu, sent in a report with a painting of the envoys. Here we see the whole mechanism at work: interview, pictures, report. And notice this: the interpreter asks the questions himself. He does more than pass on words.</w:t>
       </w:r>
     </w:p>
     <w:p>

</xml_diff>

<commit_message>
Speaker 2: merge steps 1-2, mechanism now summarized in three steps
Co-Authored-By: Claude Sonnet 5.5 <noreply@anthropic.com>
Claude-Session: https://claude.ai/code/session_01Lx1Twscw41wCKBVfzYKUb6
</commit_message>
<xml_diff>
--- a/Speaker2_speech.docx
+++ b/Speaker2_speech.docx
@@ -7,7 +7,7 @@
         <w:spacing w:after="160"/>
       </w:pPr>
       <w:r>
-        <w:t>Thank you. My teammate has shown us the setting: a busy Tang capital, a Court with twenty interpreters, and a rule to report to the Bureau of Historiography. But how did this work in real life? First, I will explain the institutional mechanism. It has four steps. Then I will test it with three cases.</w:t>
+        <w:t>Thank you. My teammate has shown us the setting: a busy Tang capital, a Court with twenty interpreters, and a rule to report to the Bureau of Historiography. But how did this work in real life? First, I will explain the institutional mechanism. Lung does not number it, but we can sum it up in three steps. Then I will test it with three cases.</w:t>
       </w:r>
     </w:p>
     <w:p>
@@ -15,7 +15,7 @@
         <w:spacing w:after="160"/>
       </w:pPr>
       <w:r>
-        <w:t>Step one is the interview. The Tang Huiyao says that when a mission arrived, the Court had to ask about the country's land and customs, its dress, the tribute it brought, the distance and route, and the names of its leaders.</w:t>
+        <w:t>Step one is the interview. The Tang Huiyao says that when a mission arrived, the Court had to ask about the country's land and customs, its dress, the tribute it brought, the distance and route, and the names of its leaders. But the envoy and the officials did not speak the same language. So everyone in the room heard the envoy through the interpreter, and his words are most likely what got written down.</w:t>
       </w:r>
     </w:p>
     <w:p>
@@ -23,7 +23,7 @@
         <w:spacing w:after="160"/>
       </w:pPr>
       <w:r>
-        <w:t>Now, who asked these questions, and in what language? That is step two. Sometimes officials from other offices joined too. But the envoy and the officials did not speak the same language. So everyone in the room heard the envoy through the interpreter.</w:t>
+        <w:t>What happened after the interview? That is step two: the record. The Tang Liudian says that maps of the foreign places and pictures of the envoys were drawn. Copies went to the Secretariat, and the originals stayed in the Court. A written report also went to the Bureau.</w:t>
       </w:r>
     </w:p>
     <w:p>
@@ -31,15 +31,7 @@
         <w:spacing w:after="160"/>
       </w:pPr>
       <w:r>
-        <w:t>After the interview comes step three: the record. The Tang Liudian says that maps of the foreign places and pictures of the envoys were drawn. Copies went to the Secretariat, and the originals stayed in the Court. A written report also went to the Bureau.</w:t>
-      </w:r>
-    </w:p>
-    <w:p>
-      <w:pPr>
-        <w:spacing w:after="160"/>
-      </w:pPr>
-      <w:r>
-        <w:t>And what did historians do with it? That is step four. We do not know if they copied the reports or changed them. But for a faraway country, the interview could be the only direct source.</w:t>
+        <w:t>And what did historians do with it? That is step three: compilation. We do not know if they copied the reports or changed them. But for a faraway country, the interview could be the only direct source.</w:t>
       </w:r>
     </w:p>
     <w:p>

</xml_diff>